<commit_message>
Agrega catálogo de símbolos y tabla de símbolos por solución
El solucionario abre con un catálogo de los símbolos ISO 1219 usados en las PD 10 y 11:
imagen, nombre, designación completa, cómo reconocerlo y para qué sirve. Cada solución
reemplaza la lista de componentes por una tabla de los símbolos que necesita, con
cantidad, referencias en el esquema y función en ese circuito. La guía del alumno
incluye el mismo catálogo en el repaso. Nuevas figuras: 3/2 con pedal, rodillo dibujado
accionado, tipos de línea y marcas de final de carrera.

Co-Authored-By: Claude Opus 5.5 <noreply@anthropic.com>
Claude-Session: https://claude.ai/code/session_016KmDAtWx8UnjEpaRPWkr7o
</commit_message>
<xml_diff>
--- a/sesion2_practica/RGIM_Guia_Practica_Dirigida_Alumno.docx
+++ b/sesion2_practica/RGIM_Guia_Practica_Dirigida_Alumno.docx
@@ -457,6 +457,2213 @@
     </w:p>
     <w:p>
       <w:pPr>
+        <w:pStyle w:val="Heading1"/>
+      </w:pPr>
+      <w:r>
+        <w:t>Símbolos que usarás</w:t>
+      </w:r>
+    </w:p>
+    <w:p>
+      <w:r>
+        <w:rPr>
+          <w:b w:val="0"/>
+          <w:i w:val="0"/>
+        </w:rPr>
+        <w:t>Cómo leer una válvula: cada cuadro es una posición; se cuentan los PUERTOS (vías) de un cuadro y los CUADROS (posiciones) → «3/2» = 3 vías, 2 posiciones. Los puertos se dibujan solo en el cuadro de reposo. El accionamiento dibujado a un lado lleva la válvula al cuadro de ese lado. Numeración: 1 presión, 2 y 4 salidas, 3 y 5 escapes, 12 y 14 pilotajes (14 conecta 1 → 4).</w:t>
+      </w:r>
+    </w:p>
+    <w:tbl>
+      <w:tblPr>
+        <w:tblStyle w:val="TableGrid"/>
+        <w:tblW w:type="auto" w:w="0"/>
+        <w:jc w:val="center"/>
+        <w:tblLayout w:type="fixed"/>
+        <w:tblLook w:firstColumn="1" w:firstRow="1" w:lastColumn="0" w:lastRow="0" w:noHBand="0" w:noVBand="1" w:val="04A0"/>
+      </w:tblPr>
+      <w:tblGrid>
+        <w:gridCol w:w="1928"/>
+        <w:gridCol w:w="2268"/>
+        <w:gridCol w:w="3175"/>
+        <w:gridCol w:w="2268"/>
+      </w:tblGrid>
+      <w:tr>
+        <w:trPr>
+          <w:cantSplit/>
+        </w:trPr>
+        <w:tc>
+          <w:tcPr>
+            <w:tcW w:type="dxa" w:w="1928"/>
+            <w:shd w:val="clear" w:color="auto" w:fill="042254"/>
+          </w:tcPr>
+          <w:p>
+            <w:r>
+              <w:rPr>
+                <w:b/>
+                <w:color w:val="FFFFFF"/>
+                <w:sz w:val="18"/>
+              </w:rPr>
+              <w:t>Símbolo</w:t>
+            </w:r>
+          </w:p>
+        </w:tc>
+        <w:tc>
+          <w:tcPr>
+            <w:tcW w:type="dxa" w:w="2268"/>
+            <w:shd w:val="clear" w:color="auto" w:fill="042254"/>
+          </w:tcPr>
+          <w:p>
+            <w:r>
+              <w:rPr>
+                <w:b/>
+                <w:color w:val="FFFFFF"/>
+                <w:sz w:val="18"/>
+              </w:rPr>
+              <w:t>Nombre y designación</w:t>
+            </w:r>
+          </w:p>
+        </w:tc>
+        <w:tc>
+          <w:tcPr>
+            <w:tcW w:type="dxa" w:w="3175"/>
+            <w:shd w:val="clear" w:color="auto" w:fill="042254"/>
+          </w:tcPr>
+          <w:p>
+            <w:r>
+              <w:rPr>
+                <w:b/>
+                <w:color w:val="FFFFFF"/>
+                <w:sz w:val="18"/>
+              </w:rPr>
+              <w:t>Cómo reconocerlo</w:t>
+            </w:r>
+          </w:p>
+        </w:tc>
+        <w:tc>
+          <w:tcPr>
+            <w:tcW w:type="dxa" w:w="2268"/>
+            <w:shd w:val="clear" w:color="auto" w:fill="042254"/>
+          </w:tcPr>
+          <w:p>
+            <w:r>
+              <w:rPr>
+                <w:b/>
+                <w:color w:val="FFFFFF"/>
+                <w:sz w:val="18"/>
+              </w:rPr>
+              <w:t>Para qué sirve</w:t>
+            </w:r>
+          </w:p>
+        </w:tc>
+      </w:tr>
+      <w:tr>
+        <w:trPr>
+          <w:cantSplit/>
+        </w:trPr>
+        <w:tc>
+          <w:tcPr>
+            <w:tcW w:type="dxa" w:w="1928"/>
+          </w:tcPr>
+          <w:p>
+            <w:pPr>
+              <w:spacing w:after="20"/>
+              <w:jc w:val="center"/>
+            </w:pPr>
+            <w:r>
+              <w:drawing>
+                <wp:inline xmlns:a="http://schemas.openxmlformats.org/drawingml/2006/main" xmlns:pic="http://schemas.openxmlformats.org/drawingml/2006/picture">
+                  <wp:extent cx="1116000" cy="439803"/>
+                  <wp:docPr id="1" name="Picture 1"/>
+                  <wp:cNvGraphicFramePr>
+                    <a:graphicFrameLocks noChangeAspect="1"/>
+                  </wp:cNvGraphicFramePr>
+                  <a:graphic>
+                    <a:graphicData uri="http://schemas.openxmlformats.org/drawingml/2006/picture">
+                      <pic:pic>
+                        <pic:nvPicPr>
+                          <pic:cNvPr id="0" name="sym_cil_de.png"/>
+                          <pic:cNvPicPr/>
+                        </pic:nvPicPr>
+                        <pic:blipFill>
+                          <a:blip r:embed="rId10"/>
+                          <a:stretch>
+                            <a:fillRect/>
+                          </a:stretch>
+                        </pic:blipFill>
+                        <pic:spPr>
+                          <a:xfrm>
+                            <a:off x="0" y="0"/>
+                            <a:ext cx="1116000" cy="439803"/>
+                          </a:xfrm>
+                          <a:prstGeom prst="rect"/>
+                        </pic:spPr>
+                      </pic:pic>
+                    </a:graphicData>
+                  </a:graphic>
+                </wp:inline>
+              </w:drawing>
+            </w:r>
+          </w:p>
+        </w:tc>
+        <w:tc>
+          <w:tcPr>
+            <w:tcW w:type="dxa" w:w="2268"/>
+          </w:tcPr>
+          <w:p>
+            <w:pPr>
+              <w:spacing w:after="20"/>
+            </w:pPr>
+            <w:r>
+              <w:rPr>
+                <w:b/>
+                <w:color w:val="042254"/>
+                <w:sz w:val="18"/>
+              </w:rPr>
+              <w:t>Cilindro de doble efecto</w:t>
+            </w:r>
+            <w:r>
+              <w:rPr>
+                <w:b w:val="0"/>
+                <w:sz w:val="18"/>
+              </w:rPr>
+              <w:br/>
+              <w:t>Actuador lineal de doble efecto</w:t>
+            </w:r>
+          </w:p>
+        </w:tc>
+        <w:tc>
+          <w:tcPr>
+            <w:tcW w:type="dxa" w:w="3175"/>
+          </w:tcPr>
+          <w:p>
+            <w:pPr>
+              <w:spacing w:after="20"/>
+            </w:pPr>
+            <w:r>
+              <w:rPr>
+                <w:b w:val="0"/>
+                <w:sz w:val="18"/>
+              </w:rPr>
+              <w:t>Rectángulo con émbolo (barra gruesa) y vástago que sale por la derecha; DOS conexiones abajo: cámara posterior y lado vástago. Sin resorte.</w:t>
+            </w:r>
+          </w:p>
+        </w:tc>
+        <w:tc>
+          <w:tcPr>
+            <w:tcW w:type="dxa" w:w="2268"/>
+          </w:tcPr>
+          <w:p>
+            <w:pPr>
+              <w:spacing w:after="20"/>
+            </w:pPr>
+            <w:r>
+              <w:rPr>
+                <w:b w:val="0"/>
+                <w:sz w:val="18"/>
+              </w:rPr>
+              <w:t>Avance (A+) y retroceso (A−) con aire. Se dibuja retraído.</w:t>
+            </w:r>
+          </w:p>
+        </w:tc>
+      </w:tr>
+      <w:tr>
+        <w:trPr>
+          <w:cantSplit/>
+        </w:trPr>
+        <w:tc>
+          <w:tcPr>
+            <w:tcW w:type="dxa" w:w="1928"/>
+          </w:tcPr>
+          <w:p>
+            <w:pPr>
+              <w:spacing w:after="20"/>
+              <w:jc w:val="center"/>
+            </w:pPr>
+            <w:r>
+              <w:drawing>
+                <wp:inline xmlns:a="http://schemas.openxmlformats.org/drawingml/2006/main" xmlns:pic="http://schemas.openxmlformats.org/drawingml/2006/picture">
+                  <wp:extent cx="1116000" cy="451577"/>
+                  <wp:docPr id="2" name="Picture 2"/>
+                  <wp:cNvGraphicFramePr>
+                    <a:graphicFrameLocks noChangeAspect="1"/>
+                  </wp:cNvGraphicFramePr>
+                  <a:graphic>
+                    <a:graphicData uri="http://schemas.openxmlformats.org/drawingml/2006/picture">
+                      <pic:pic>
+                        <pic:nvPicPr>
+                          <pic:cNvPr id="0" name="sym_marcas.png"/>
+                          <pic:cNvPicPr/>
+                        </pic:nvPicPr>
+                        <pic:blipFill>
+                          <a:blip r:embed="rId11"/>
+                          <a:stretch>
+                            <a:fillRect/>
+                          </a:stretch>
+                        </pic:blipFill>
+                        <pic:spPr>
+                          <a:xfrm>
+                            <a:off x="0" y="0"/>
+                            <a:ext cx="1116000" cy="451577"/>
+                          </a:xfrm>
+                          <a:prstGeom prst="rect"/>
+                        </pic:spPr>
+                      </pic:pic>
+                    </a:graphicData>
+                  </a:graphic>
+                </wp:inline>
+              </w:drawing>
+            </w:r>
+          </w:p>
+        </w:tc>
+        <w:tc>
+          <w:tcPr>
+            <w:tcW w:type="dxa" w:w="2268"/>
+          </w:tcPr>
+          <w:p>
+            <w:pPr>
+              <w:spacing w:after="20"/>
+            </w:pPr>
+            <w:r>
+              <w:rPr>
+                <w:b/>
+                <w:color w:val="042254"/>
+                <w:sz w:val="18"/>
+              </w:rPr>
+              <w:t>Marcas de final de carrera</w:t>
+            </w:r>
+            <w:r>
+              <w:rPr>
+                <w:b w:val="0"/>
+                <w:sz w:val="18"/>
+              </w:rPr>
+              <w:br/>
+              <w:t>Posiciones a0 (retraído) y a1 (extendido) del cilindro A</w:t>
+            </w:r>
+          </w:p>
+        </w:tc>
+        <w:tc>
+          <w:tcPr>
+            <w:tcW w:type="dxa" w:w="3175"/>
+          </w:tcPr>
+          <w:p>
+            <w:pPr>
+              <w:spacing w:after="20"/>
+            </w:pPr>
+            <w:r>
+              <w:rPr>
+                <w:b w:val="0"/>
+                <w:sz w:val="18"/>
+              </w:rPr>
+              <w:t>Trazos verticales sobre el vástago con su nombre (a0, a1). El mismo nombre aparece junto al rodillo de la válvula que lo detecta.</w:t>
+            </w:r>
+          </w:p>
+        </w:tc>
+        <w:tc>
+          <w:tcPr>
+            <w:tcW w:type="dxa" w:w="2268"/>
+          </w:tcPr>
+          <w:p>
+            <w:pPr>
+              <w:spacing w:after="20"/>
+            </w:pPr>
+            <w:r>
+              <w:rPr>
+                <w:b w:val="0"/>
+                <w:sz w:val="18"/>
+              </w:rPr>
+              <w:t>Indican DÓNDE está físicamente el rodillo que se dibuja abajo.</w:t>
+            </w:r>
+          </w:p>
+        </w:tc>
+      </w:tr>
+      <w:tr>
+        <w:trPr>
+          <w:cantSplit/>
+        </w:trPr>
+        <w:tc>
+          <w:tcPr>
+            <w:tcW w:type="dxa" w:w="1928"/>
+          </w:tcPr>
+          <w:p>
+            <w:pPr>
+              <w:spacing w:after="20"/>
+              <w:jc w:val="center"/>
+            </w:pPr>
+            <w:r>
+              <w:drawing>
+                <wp:inline xmlns:a="http://schemas.openxmlformats.org/drawingml/2006/main" xmlns:pic="http://schemas.openxmlformats.org/drawingml/2006/picture">
+                  <wp:extent cx="1046239" cy="618466"/>
+                  <wp:docPr id="3" name="Picture 3"/>
+                  <wp:cNvGraphicFramePr>
+                    <a:graphicFrameLocks noChangeAspect="1"/>
+                  </wp:cNvGraphicFramePr>
+                  <a:graphic>
+                    <a:graphicData uri="http://schemas.openxmlformats.org/drawingml/2006/picture">
+                      <pic:pic>
+                        <pic:nvPicPr>
+                          <pic:cNvPr id="0" name="sym_32_boton.png"/>
+                          <pic:cNvPicPr/>
+                        </pic:nvPicPr>
+                        <pic:blipFill>
+                          <a:blip r:embed="rId12"/>
+                          <a:stretch>
+                            <a:fillRect/>
+                          </a:stretch>
+                        </pic:blipFill>
+                        <pic:spPr>
+                          <a:xfrm>
+                            <a:off x="0" y="0"/>
+                            <a:ext cx="1046239" cy="618466"/>
+                          </a:xfrm>
+                          <a:prstGeom prst="rect"/>
+                        </pic:spPr>
+                      </pic:pic>
+                    </a:graphicData>
+                  </a:graphic>
+                </wp:inline>
+              </w:drawing>
+            </w:r>
+          </w:p>
+        </w:tc>
+        <w:tc>
+          <w:tcPr>
+            <w:tcW w:type="dxa" w:w="2268"/>
+          </w:tcPr>
+          <w:p>
+            <w:pPr>
+              <w:spacing w:after="20"/>
+            </w:pPr>
+            <w:r>
+              <w:rPr>
+                <w:b/>
+                <w:color w:val="042254"/>
+                <w:sz w:val="18"/>
+              </w:rPr>
+              <w:t>Válvula 3/2 NC con pulsador</w:t>
+            </w:r>
+            <w:r>
+              <w:rPr>
+                <w:b w:val="0"/>
+                <w:sz w:val="18"/>
+              </w:rPr>
+              <w:br/>
+              <w:t>Válvula distribuidora 3/2, normalmente cerrada, accionamiento por pulsador, retorno por resorte</w:t>
+            </w:r>
+          </w:p>
+        </w:tc>
+        <w:tc>
+          <w:tcPr>
+            <w:tcW w:type="dxa" w:w="3175"/>
+          </w:tcPr>
+          <w:p>
+            <w:pPr>
+              <w:spacing w:after="20"/>
+            </w:pPr>
+            <w:r>
+              <w:rPr>
+                <w:b w:val="0"/>
+                <w:sz w:val="18"/>
+              </w:rPr>
+              <w:t>2 cuadros y 3 puertos (1, 2, 3). En el cuadro de reposo (derecha) el 1 está bloqueado (símbolo T) y 2 descarga a 3. A la izquierda la «seta» del pulsador; a la derecha el resorte.</w:t>
+            </w:r>
+          </w:p>
+        </w:tc>
+        <w:tc>
+          <w:tcPr>
+            <w:tcW w:type="dxa" w:w="2268"/>
+          </w:tcPr>
+          <w:p>
+            <w:pPr>
+              <w:spacing w:after="20"/>
+            </w:pPr>
+            <w:r>
+              <w:rPr>
+                <w:b w:val="0"/>
+                <w:sz w:val="18"/>
+              </w:rPr>
+              <w:t>Elemento de señal manual (S, S1…): mientras se pulsa, envía aire por 2.</w:t>
+            </w:r>
+          </w:p>
+        </w:tc>
+      </w:tr>
+      <w:tr>
+        <w:trPr>
+          <w:cantSplit/>
+        </w:trPr>
+        <w:tc>
+          <w:tcPr>
+            <w:tcW w:type="dxa" w:w="1928"/>
+          </w:tcPr>
+          <w:p>
+            <w:pPr>
+              <w:spacing w:after="20"/>
+              <w:jc w:val="center"/>
+            </w:pPr>
+            <w:r>
+              <w:drawing>
+                <wp:inline xmlns:a="http://schemas.openxmlformats.org/drawingml/2006/main" xmlns:pic="http://schemas.openxmlformats.org/drawingml/2006/picture">
+                  <wp:extent cx="1046239" cy="618466"/>
+                  <wp:docPr id="4" name="Picture 4"/>
+                  <wp:cNvGraphicFramePr>
+                    <a:graphicFrameLocks noChangeAspect="1"/>
+                  </wp:cNvGraphicFramePr>
+                  <a:graphic>
+                    <a:graphicData uri="http://schemas.openxmlformats.org/drawingml/2006/picture">
+                      <pic:pic>
+                        <pic:nvPicPr>
+                          <pic:cNvPr id="0" name="sym_32_pedal.png"/>
+                          <pic:cNvPicPr/>
+                        </pic:nvPicPr>
+                        <pic:blipFill>
+                          <a:blip r:embed="rId13"/>
+                          <a:stretch>
+                            <a:fillRect/>
+                          </a:stretch>
+                        </pic:blipFill>
+                        <pic:spPr>
+                          <a:xfrm>
+                            <a:off x="0" y="0"/>
+                            <a:ext cx="1046239" cy="618466"/>
+                          </a:xfrm>
+                          <a:prstGeom prst="rect"/>
+                        </pic:spPr>
+                      </pic:pic>
+                    </a:graphicData>
+                  </a:graphic>
+                </wp:inline>
+              </w:drawing>
+            </w:r>
+          </w:p>
+        </w:tc>
+        <w:tc>
+          <w:tcPr>
+            <w:tcW w:type="dxa" w:w="2268"/>
+          </w:tcPr>
+          <w:p>
+            <w:pPr>
+              <w:spacing w:after="20"/>
+            </w:pPr>
+            <w:r>
+              <w:rPr>
+                <w:b/>
+                <w:color w:val="042254"/>
+                <w:sz w:val="18"/>
+              </w:rPr>
+              <w:t>Válvula 3/2 NC con pedal</w:t>
+            </w:r>
+            <w:r>
+              <w:rPr>
+                <w:b w:val="0"/>
+                <w:sz w:val="18"/>
+              </w:rPr>
+              <w:br/>
+              <w:t>Válvula distribuidora 3/2 NC, accionamiento por pedal, retorno por resorte</w:t>
+            </w:r>
+          </w:p>
+        </w:tc>
+        <w:tc>
+          <w:tcPr>
+            <w:tcW w:type="dxa" w:w="3175"/>
+          </w:tcPr>
+          <w:p>
+            <w:pPr>
+              <w:spacing w:after="20"/>
+            </w:pPr>
+            <w:r>
+              <w:rPr>
+                <w:b w:val="0"/>
+                <w:sz w:val="18"/>
+              </w:rPr>
+              <w:t>Igual que la de pulsador, pero el accionamiento es una palanca inclinada (pedal) a la izquierda.</w:t>
+            </w:r>
+          </w:p>
+        </w:tc>
+        <w:tc>
+          <w:tcPr>
+            <w:tcW w:type="dxa" w:w="2268"/>
+          </w:tcPr>
+          <w:p>
+            <w:pPr>
+              <w:spacing w:after="20"/>
+            </w:pPr>
+            <w:r>
+              <w:rPr>
+                <w:b w:val="0"/>
+                <w:sz w:val="18"/>
+              </w:rPr>
+              <w:t>Señal manual accionada con el pie.</w:t>
+            </w:r>
+          </w:p>
+        </w:tc>
+      </w:tr>
+      <w:tr>
+        <w:trPr>
+          <w:cantSplit/>
+        </w:trPr>
+        <w:tc>
+          <w:tcPr>
+            <w:tcW w:type="dxa" w:w="1928"/>
+          </w:tcPr>
+          <w:p>
+            <w:pPr>
+              <w:spacing w:after="20"/>
+              <w:jc w:val="center"/>
+            </w:pPr>
+            <w:r>
+              <w:drawing>
+                <wp:inline xmlns:a="http://schemas.openxmlformats.org/drawingml/2006/main" xmlns:pic="http://schemas.openxmlformats.org/drawingml/2006/picture">
+                  <wp:extent cx="1046239" cy="618466"/>
+                  <wp:docPr id="5" name="Picture 5"/>
+                  <wp:cNvGraphicFramePr>
+                    <a:graphicFrameLocks noChangeAspect="1"/>
+                  </wp:cNvGraphicFramePr>
+                  <a:graphic>
+                    <a:graphicData uri="http://schemas.openxmlformats.org/drawingml/2006/picture">
+                      <pic:pic>
+                        <pic:nvPicPr>
+                          <pic:cNvPr id="0" name="sym_32_rodillo.png"/>
+                          <pic:cNvPicPr/>
+                        </pic:nvPicPr>
+                        <pic:blipFill>
+                          <a:blip r:embed="rId14"/>
+                          <a:stretch>
+                            <a:fillRect/>
+                          </a:stretch>
+                        </pic:blipFill>
+                        <pic:spPr>
+                          <a:xfrm>
+                            <a:off x="0" y="0"/>
+                            <a:ext cx="1046239" cy="618466"/>
+                          </a:xfrm>
+                          <a:prstGeom prst="rect"/>
+                        </pic:spPr>
+                      </pic:pic>
+                    </a:graphicData>
+                  </a:graphic>
+                </wp:inline>
+              </w:drawing>
+            </w:r>
+          </w:p>
+        </w:tc>
+        <w:tc>
+          <w:tcPr>
+            <w:tcW w:type="dxa" w:w="2268"/>
+          </w:tcPr>
+          <w:p>
+            <w:pPr>
+              <w:spacing w:after="20"/>
+            </w:pPr>
+            <w:r>
+              <w:rPr>
+                <w:b/>
+                <w:color w:val="042254"/>
+                <w:sz w:val="18"/>
+              </w:rPr>
+              <w:t>Válvula 3/2 NC con rodillo (final de carrera)</w:t>
+            </w:r>
+            <w:r>
+              <w:rPr>
+                <w:b w:val="0"/>
+                <w:sz w:val="18"/>
+              </w:rPr>
+              <w:br/>
+              <w:t>Válvula distribuidora 3/2 NC, accionamiento por rodillo, retorno por resorte</w:t>
+            </w:r>
+          </w:p>
+        </w:tc>
+        <w:tc>
+          <w:tcPr>
+            <w:tcW w:type="dxa" w:w="3175"/>
+          </w:tcPr>
+          <w:p>
+            <w:pPr>
+              <w:spacing w:after="20"/>
+            </w:pPr>
+            <w:r>
+              <w:rPr>
+                <w:b w:val="0"/>
+                <w:sz w:val="18"/>
+              </w:rPr>
+              <w:t>3/2 con un pequeño CÍRCULO (rodillo) en un vástago a la izquierda y su nombre (a1, b1…). Dibujada en reposo: puertos en el cuadro derecho, 1 bloqueado.</w:t>
+            </w:r>
+          </w:p>
+        </w:tc>
+        <w:tc>
+          <w:tcPr>
+            <w:tcW w:type="dxa" w:w="2268"/>
+          </w:tcPr>
+          <w:p>
+            <w:pPr>
+              <w:spacing w:after="20"/>
+            </w:pPr>
+            <w:r>
+              <w:rPr>
+                <w:b w:val="0"/>
+                <w:sz w:val="18"/>
+              </w:rPr>
+              <w:t>Detecta que el cilindro llegó a esa posición y envía una señal.</w:t>
+            </w:r>
+          </w:p>
+        </w:tc>
+      </w:tr>
+      <w:tr>
+        <w:trPr>
+          <w:cantSplit/>
+        </w:trPr>
+        <w:tc>
+          <w:tcPr>
+            <w:tcW w:type="dxa" w:w="1928"/>
+          </w:tcPr>
+          <w:p>
+            <w:pPr>
+              <w:spacing w:after="20"/>
+              <w:jc w:val="center"/>
+            </w:pPr>
+            <w:r>
+              <w:drawing>
+                <wp:inline xmlns:a="http://schemas.openxmlformats.org/drawingml/2006/main" xmlns:pic="http://schemas.openxmlformats.org/drawingml/2006/picture">
+                  <wp:extent cx="1046239" cy="618466"/>
+                  <wp:docPr id="6" name="Picture 6"/>
+                  <wp:cNvGraphicFramePr>
+                    <a:graphicFrameLocks noChangeAspect="1"/>
+                  </wp:cNvGraphicFramePr>
+                  <a:graphic>
+                    <a:graphicData uri="http://schemas.openxmlformats.org/drawingml/2006/picture">
+                      <pic:pic>
+                        <pic:nvPicPr>
+                          <pic:cNvPr id="0" name="sym_32_rodillo_accionado.png"/>
+                          <pic:cNvPicPr/>
+                        </pic:nvPicPr>
+                        <pic:blipFill>
+                          <a:blip r:embed="rId15"/>
+                          <a:stretch>
+                            <a:fillRect/>
+                          </a:stretch>
+                        </pic:blipFill>
+                        <pic:spPr>
+                          <a:xfrm>
+                            <a:off x="0" y="0"/>
+                            <a:ext cx="1046239" cy="618466"/>
+                          </a:xfrm>
+                          <a:prstGeom prst="rect"/>
+                        </pic:spPr>
+                      </pic:pic>
+                    </a:graphicData>
+                  </a:graphic>
+                </wp:inline>
+              </w:drawing>
+            </w:r>
+          </w:p>
+        </w:tc>
+        <w:tc>
+          <w:tcPr>
+            <w:tcW w:type="dxa" w:w="2268"/>
+          </w:tcPr>
+          <w:p>
+            <w:pPr>
+              <w:spacing w:after="20"/>
+            </w:pPr>
+            <w:r>
+              <w:rPr>
+                <w:b/>
+                <w:color w:val="042254"/>
+                <w:sz w:val="18"/>
+              </w:rPr>
+              <w:t>Válvula 3/2 con rodillo, dibujada accionada</w:t>
+            </w:r>
+            <w:r>
+              <w:rPr>
+                <w:b w:val="0"/>
+                <w:sz w:val="18"/>
+              </w:rPr>
+              <w:br/>
+              <w:t>La misma válvula de rodillo, pisada por el vástago en la posición inicial</w:t>
+            </w:r>
+          </w:p>
+        </w:tc>
+        <w:tc>
+          <w:tcPr>
+            <w:tcW w:type="dxa" w:w="3175"/>
+          </w:tcPr>
+          <w:p>
+            <w:pPr>
+              <w:spacing w:after="20"/>
+            </w:pPr>
+            <w:r>
+              <w:rPr>
+                <w:b w:val="0"/>
+                <w:sz w:val="18"/>
+              </w:rPr>
+              <w:t>Los puertos están conectados al cuadro IZQUIERDO: la flecha 1 → 2 queda en línea con los puertos. Así se dibujan a0, b0, c0 porque en reposo el vástago las pisa.</w:t>
+            </w:r>
+          </w:p>
+        </w:tc>
+        <w:tc>
+          <w:tcPr>
+            <w:tcW w:type="dxa" w:w="2268"/>
+          </w:tcPr>
+          <w:p>
+            <w:pPr>
+              <w:spacing w:after="20"/>
+            </w:pPr>
+            <w:r>
+              <w:rPr>
+                <w:b w:val="0"/>
+                <w:sz w:val="18"/>
+              </w:rPr>
+              <w:t>Confirma que el cilindro está en su posición inicial (retraído).</w:t>
+            </w:r>
+          </w:p>
+        </w:tc>
+      </w:tr>
+      <w:tr>
+        <w:trPr>
+          <w:cantSplit/>
+        </w:trPr>
+        <w:tc>
+          <w:tcPr>
+            <w:tcW w:type="dxa" w:w="1928"/>
+          </w:tcPr>
+          <w:p>
+            <w:pPr>
+              <w:spacing w:after="20"/>
+              <w:jc w:val="center"/>
+            </w:pPr>
+            <w:r>
+              <w:drawing>
+                <wp:inline xmlns:a="http://schemas.openxmlformats.org/drawingml/2006/main" xmlns:pic="http://schemas.openxmlformats.org/drawingml/2006/picture">
+                  <wp:extent cx="1046239" cy="618466"/>
+                  <wp:docPr id="7" name="Picture 7"/>
+                  <wp:cNvGraphicFramePr>
+                    <a:graphicFrameLocks noChangeAspect="1"/>
+                  </wp:cNvGraphicFramePr>
+                  <a:graphic>
+                    <a:graphicData uri="http://schemas.openxmlformats.org/drawingml/2006/picture">
+                      <pic:pic>
+                        <pic:nvPicPr>
+                          <pic:cNvPr id="0" name="sym_52_biestable.png"/>
+                          <pic:cNvPicPr/>
+                        </pic:nvPicPr>
+                        <pic:blipFill>
+                          <a:blip r:embed="rId16"/>
+                          <a:stretch>
+                            <a:fillRect/>
+                          </a:stretch>
+                        </pic:blipFill>
+                        <pic:spPr>
+                          <a:xfrm>
+                            <a:off x="0" y="0"/>
+                            <a:ext cx="1046239" cy="618466"/>
+                          </a:xfrm>
+                          <a:prstGeom prst="rect"/>
+                        </pic:spPr>
+                      </pic:pic>
+                    </a:graphicData>
+                  </a:graphic>
+                </wp:inline>
+              </w:drawing>
+            </w:r>
+          </w:p>
+        </w:tc>
+        <w:tc>
+          <w:tcPr>
+            <w:tcW w:type="dxa" w:w="2268"/>
+          </w:tcPr>
+          <w:p>
+            <w:pPr>
+              <w:spacing w:after="20"/>
+            </w:pPr>
+            <w:r>
+              <w:rPr>
+                <w:b/>
+                <w:color w:val="042254"/>
+                <w:sz w:val="18"/>
+              </w:rPr>
+              <w:t>Válvula 5/2 biestable (piloto / piloto)</w:t>
+            </w:r>
+            <w:r>
+              <w:rPr>
+                <w:b w:val="0"/>
+                <w:sz w:val="18"/>
+              </w:rPr>
+              <w:br/>
+              <w:t>Válvula distribuidora 5/2, accionamiento neumático por ambos lados (14 y 12)</w:t>
+            </w:r>
+          </w:p>
+        </w:tc>
+        <w:tc>
+          <w:tcPr>
+            <w:tcW w:type="dxa" w:w="3175"/>
+          </w:tcPr>
+          <w:p>
+            <w:pPr>
+              <w:spacing w:after="20"/>
+            </w:pPr>
+            <w:r>
+              <w:rPr>
+                <w:b w:val="0"/>
+                <w:sz w:val="18"/>
+              </w:rPr>
+              <w:t>2 cuadros y 5 puertos: arriba 4 y 2, abajo 5, 1 y 3. Un triángulo de pilotaje a CADA lado (14 a la izquierda, 12 a la derecha) y NINGÚN resorte.</w:t>
+            </w:r>
+          </w:p>
+        </w:tc>
+        <w:tc>
+          <w:tcPr>
+            <w:tcW w:type="dxa" w:w="2268"/>
+          </w:tcPr>
+          <w:p>
+            <w:pPr>
+              <w:spacing w:after="20"/>
+            </w:pPr>
+            <w:r>
+              <w:rPr>
+                <w:b w:val="0"/>
+                <w:sz w:val="18"/>
+              </w:rPr>
+              <w:t>Válvula de potencia con MEMORIA: un pulso en 14 → A+, un pulso en 12 → A−. También es la selectora de grupo VG en la cascada.</w:t>
+            </w:r>
+          </w:p>
+        </w:tc>
+      </w:tr>
+      <w:tr>
+        <w:trPr>
+          <w:cantSplit/>
+        </w:trPr>
+        <w:tc>
+          <w:tcPr>
+            <w:tcW w:type="dxa" w:w="1928"/>
+          </w:tcPr>
+          <w:p>
+            <w:pPr>
+              <w:spacing w:after="20"/>
+              <w:jc w:val="center"/>
+            </w:pPr>
+            <w:r>
+              <w:drawing>
+                <wp:inline xmlns:a="http://schemas.openxmlformats.org/drawingml/2006/main" xmlns:pic="http://schemas.openxmlformats.org/drawingml/2006/picture">
+                  <wp:extent cx="1046239" cy="618466"/>
+                  <wp:docPr id="8" name="Picture 8"/>
+                  <wp:cNvGraphicFramePr>
+                    <a:graphicFrameLocks noChangeAspect="1"/>
+                  </wp:cNvGraphicFramePr>
+                  <a:graphic>
+                    <a:graphicData uri="http://schemas.openxmlformats.org/drawingml/2006/picture">
+                      <pic:pic>
+                        <pic:nvPicPr>
+                          <pic:cNvPr id="0" name="sym_42_biestable.png"/>
+                          <pic:cNvPicPr/>
+                        </pic:nvPicPr>
+                        <pic:blipFill>
+                          <a:blip r:embed="rId17"/>
+                          <a:stretch>
+                            <a:fillRect/>
+                          </a:stretch>
+                        </pic:blipFill>
+                        <pic:spPr>
+                          <a:xfrm>
+                            <a:off x="0" y="0"/>
+                            <a:ext cx="1046239" cy="618466"/>
+                          </a:xfrm>
+                          <a:prstGeom prst="rect"/>
+                        </pic:spPr>
+                      </pic:pic>
+                    </a:graphicData>
+                  </a:graphic>
+                </wp:inline>
+              </w:drawing>
+            </w:r>
+          </w:p>
+        </w:tc>
+        <w:tc>
+          <w:tcPr>
+            <w:tcW w:type="dxa" w:w="2268"/>
+          </w:tcPr>
+          <w:p>
+            <w:pPr>
+              <w:spacing w:after="20"/>
+            </w:pPr>
+            <w:r>
+              <w:rPr>
+                <w:b/>
+                <w:color w:val="042254"/>
+                <w:sz w:val="18"/>
+              </w:rPr>
+              <w:t>Válvula 4/2 biestable (piloto / piloto)</w:t>
+            </w:r>
+            <w:r>
+              <w:rPr>
+                <w:b w:val="0"/>
+                <w:sz w:val="18"/>
+              </w:rPr>
+              <w:br/>
+              <w:t>Válvula distribuidora 4/2, accionamiento y retorno por pulso neumático</w:t>
+            </w:r>
+          </w:p>
+        </w:tc>
+        <w:tc>
+          <w:tcPr>
+            <w:tcW w:type="dxa" w:w="3175"/>
+          </w:tcPr>
+          <w:p>
+            <w:pPr>
+              <w:spacing w:after="20"/>
+            </w:pPr>
+            <w:r>
+              <w:rPr>
+                <w:b w:val="0"/>
+                <w:sz w:val="18"/>
+              </w:rPr>
+              <w:t>2 cuadros y 4 puertos: arriba 4 y 2, abajo 1 y 3. En reposo las flechas se cruzan (1→2, 4→3). Pilotajes 14 y 12, sin resorte.</w:t>
+            </w:r>
+          </w:p>
+        </w:tc>
+        <w:tc>
+          <w:tcPr>
+            <w:tcW w:type="dxa" w:w="2268"/>
+          </w:tcPr>
+          <w:p>
+            <w:pPr>
+              <w:spacing w:after="20"/>
+            </w:pPr>
+            <w:r>
+              <w:rPr>
+                <w:b w:val="0"/>
+                <w:sz w:val="18"/>
+              </w:rPr>
+              <w:t>Igual que la 5/2 biestable, con un solo escape.</w:t>
+            </w:r>
+          </w:p>
+        </w:tc>
+      </w:tr>
+      <w:tr>
+        <w:trPr>
+          <w:cantSplit/>
+        </w:trPr>
+        <w:tc>
+          <w:tcPr>
+            <w:tcW w:type="dxa" w:w="1928"/>
+          </w:tcPr>
+          <w:p>
+            <w:pPr>
+              <w:spacing w:after="20"/>
+              <w:jc w:val="center"/>
+            </w:pPr>
+            <w:r>
+              <w:drawing>
+                <wp:inline xmlns:a="http://schemas.openxmlformats.org/drawingml/2006/main" xmlns:pic="http://schemas.openxmlformats.org/drawingml/2006/picture">
+                  <wp:extent cx="1046239" cy="618466"/>
+                  <wp:docPr id="9" name="Picture 9"/>
+                  <wp:cNvGraphicFramePr>
+                    <a:graphicFrameLocks noChangeAspect="1"/>
+                  </wp:cNvGraphicFramePr>
+                  <a:graphic>
+                    <a:graphicData uri="http://schemas.openxmlformats.org/drawingml/2006/picture">
+                      <pic:pic>
+                        <pic:nvPicPr>
+                          <pic:cNvPr id="0" name="sym_52_boton.png"/>
+                          <pic:cNvPicPr/>
+                        </pic:nvPicPr>
+                        <pic:blipFill>
+                          <a:blip r:embed="rId18"/>
+                          <a:stretch>
+                            <a:fillRect/>
+                          </a:stretch>
+                        </pic:blipFill>
+                        <pic:spPr>
+                          <a:xfrm>
+                            <a:off x="0" y="0"/>
+                            <a:ext cx="1046239" cy="618466"/>
+                          </a:xfrm>
+                          <a:prstGeom prst="rect"/>
+                        </pic:spPr>
+                      </pic:pic>
+                    </a:graphicData>
+                  </a:graphic>
+                </wp:inline>
+              </w:drawing>
+            </w:r>
+          </w:p>
+        </w:tc>
+        <w:tc>
+          <w:tcPr>
+            <w:tcW w:type="dxa" w:w="2268"/>
+          </w:tcPr>
+          <w:p>
+            <w:pPr>
+              <w:spacing w:after="20"/>
+            </w:pPr>
+            <w:r>
+              <w:rPr>
+                <w:b/>
+                <w:color w:val="042254"/>
+                <w:sz w:val="18"/>
+              </w:rPr>
+              <w:t>Válvula 5/2 con pulsador y resorte</w:t>
+            </w:r>
+            <w:r>
+              <w:rPr>
+                <w:b w:val="0"/>
+                <w:sz w:val="18"/>
+              </w:rPr>
+              <w:br/>
+              <w:t>Válvula distribuidora 5/2 monoestable, accionamiento por pulsador, retorno por resorte</w:t>
+            </w:r>
+          </w:p>
+        </w:tc>
+        <w:tc>
+          <w:tcPr>
+            <w:tcW w:type="dxa" w:w="3175"/>
+          </w:tcPr>
+          <w:p>
+            <w:pPr>
+              <w:spacing w:after="20"/>
+            </w:pPr>
+            <w:r>
+              <w:rPr>
+                <w:b w:val="0"/>
+                <w:sz w:val="18"/>
+              </w:rPr>
+              <w:t>5 puertos como la 5/2 biestable, pero con pulsador a la izquierda y resorte a la derecha.</w:t>
+            </w:r>
+          </w:p>
+        </w:tc>
+        <w:tc>
+          <w:tcPr>
+            <w:tcW w:type="dxa" w:w="2268"/>
+          </w:tcPr>
+          <w:p>
+            <w:pPr>
+              <w:spacing w:after="20"/>
+            </w:pPr>
+            <w:r>
+              <w:rPr>
+                <w:b w:val="0"/>
+                <w:sz w:val="18"/>
+              </w:rPr>
+              <w:t>Mando directo: el cilindro sale mientras se pulsa y vuelve al soltar.</w:t>
+            </w:r>
+          </w:p>
+        </w:tc>
+      </w:tr>
+      <w:tr>
+        <w:trPr>
+          <w:cantSplit/>
+        </w:trPr>
+        <w:tc>
+          <w:tcPr>
+            <w:tcW w:type="dxa" w:w="1928"/>
+          </w:tcPr>
+          <w:p>
+            <w:pPr>
+              <w:spacing w:after="20"/>
+              <w:jc w:val="center"/>
+            </w:pPr>
+            <w:r>
+              <w:drawing>
+                <wp:inline xmlns:a="http://schemas.openxmlformats.org/drawingml/2006/main" xmlns:pic="http://schemas.openxmlformats.org/drawingml/2006/picture">
+                  <wp:extent cx="618466" cy="378810"/>
+                  <wp:docPr id="10" name="Picture 10"/>
+                  <wp:cNvGraphicFramePr>
+                    <a:graphicFrameLocks noChangeAspect="1"/>
+                  </wp:cNvGraphicFramePr>
+                  <a:graphic>
+                    <a:graphicData uri="http://schemas.openxmlformats.org/drawingml/2006/picture">
+                      <pic:pic>
+                        <pic:nvPicPr>
+                          <pic:cNvPr id="0" name="sym_or.png"/>
+                          <pic:cNvPicPr/>
+                        </pic:nvPicPr>
+                        <pic:blipFill>
+                          <a:blip r:embed="rId19"/>
+                          <a:stretch>
+                            <a:fillRect/>
+                          </a:stretch>
+                        </pic:blipFill>
+                        <pic:spPr>
+                          <a:xfrm>
+                            <a:off x="0" y="0"/>
+                            <a:ext cx="618466" cy="378810"/>
+                          </a:xfrm>
+                          <a:prstGeom prst="rect"/>
+                        </pic:spPr>
+                      </pic:pic>
+                    </a:graphicData>
+                  </a:graphic>
+                </wp:inline>
+              </w:drawing>
+            </w:r>
+          </w:p>
+        </w:tc>
+        <w:tc>
+          <w:tcPr>
+            <w:tcW w:type="dxa" w:w="2268"/>
+          </w:tcPr>
+          <w:p>
+            <w:pPr>
+              <w:spacing w:after="20"/>
+            </w:pPr>
+            <w:r>
+              <w:rPr>
+                <w:b/>
+                <w:color w:val="042254"/>
+                <w:sz w:val="18"/>
+              </w:rPr>
+              <w:t>Válvula selectora (función O)</w:t>
+            </w:r>
+            <w:r>
+              <w:rPr>
+                <w:b w:val="0"/>
+                <w:sz w:val="18"/>
+              </w:rPr>
+              <w:br/>
+              <w:t>Válvula selectora de circuito («shuttle»)</w:t>
+            </w:r>
+          </w:p>
+        </w:tc>
+        <w:tc>
+          <w:tcPr>
+            <w:tcW w:type="dxa" w:w="3175"/>
+          </w:tcPr>
+          <w:p>
+            <w:pPr>
+              <w:spacing w:after="20"/>
+            </w:pPr>
+            <w:r>
+              <w:rPr>
+                <w:b w:val="0"/>
+                <w:sz w:val="18"/>
+              </w:rPr>
+              <w:t>Rectángulo horizontal con una BOLA en el centro y un asiento a cada lado; dos entradas 1 (izquierda y derecha) y una salida 2 arriba.</w:t>
+            </w:r>
+          </w:p>
+        </w:tc>
+        <w:tc>
+          <w:tcPr>
+            <w:tcW w:type="dxa" w:w="2268"/>
+          </w:tcPr>
+          <w:p>
+            <w:pPr>
+              <w:spacing w:after="20"/>
+            </w:pPr>
+            <w:r>
+              <w:rPr>
+                <w:b w:val="0"/>
+                <w:sz w:val="18"/>
+              </w:rPr>
+              <w:t>Hay aire en 2 si llega por una entrada U otra (dos lugares de mando).</w:t>
+            </w:r>
+          </w:p>
+        </w:tc>
+      </w:tr>
+      <w:tr>
+        <w:trPr>
+          <w:cantSplit/>
+        </w:trPr>
+        <w:tc>
+          <w:tcPr>
+            <w:tcW w:type="dxa" w:w="1928"/>
+          </w:tcPr>
+          <w:p>
+            <w:pPr>
+              <w:spacing w:after="20"/>
+              <w:jc w:val="center"/>
+            </w:pPr>
+            <w:r>
+              <w:drawing>
+                <wp:inline xmlns:a="http://schemas.openxmlformats.org/drawingml/2006/main" xmlns:pic="http://schemas.openxmlformats.org/drawingml/2006/picture">
+                  <wp:extent cx="618466" cy="378810"/>
+                  <wp:docPr id="11" name="Picture 11"/>
+                  <wp:cNvGraphicFramePr>
+                    <a:graphicFrameLocks noChangeAspect="1"/>
+                  </wp:cNvGraphicFramePr>
+                  <a:graphic>
+                    <a:graphicData uri="http://schemas.openxmlformats.org/drawingml/2006/picture">
+                      <pic:pic>
+                        <pic:nvPicPr>
+                          <pic:cNvPr id="0" name="sym_and.png"/>
+                          <pic:cNvPicPr/>
+                        </pic:nvPicPr>
+                        <pic:blipFill>
+                          <a:blip r:embed="rId20"/>
+                          <a:stretch>
+                            <a:fillRect/>
+                          </a:stretch>
+                        </pic:blipFill>
+                        <pic:spPr>
+                          <a:xfrm>
+                            <a:off x="0" y="0"/>
+                            <a:ext cx="618466" cy="378810"/>
+                          </a:xfrm>
+                          <a:prstGeom prst="rect"/>
+                        </pic:spPr>
+                      </pic:pic>
+                    </a:graphicData>
+                  </a:graphic>
+                </wp:inline>
+              </w:drawing>
+            </w:r>
+          </w:p>
+        </w:tc>
+        <w:tc>
+          <w:tcPr>
+            <w:tcW w:type="dxa" w:w="2268"/>
+          </w:tcPr>
+          <w:p>
+            <w:pPr>
+              <w:spacing w:after="20"/>
+            </w:pPr>
+            <w:r>
+              <w:rPr>
+                <w:b/>
+                <w:color w:val="042254"/>
+                <w:sz w:val="18"/>
+              </w:rPr>
+              <w:t>Válvula de simultaneidad (función Y)</w:t>
+            </w:r>
+            <w:r>
+              <w:rPr>
+                <w:b w:val="0"/>
+                <w:sz w:val="18"/>
+              </w:rPr>
+              <w:br/>
+              <w:t>Válvula de simultaneidad (de dos presiones)</w:t>
+            </w:r>
+          </w:p>
+        </w:tc>
+        <w:tc>
+          <w:tcPr>
+            <w:tcW w:type="dxa" w:w="3175"/>
+          </w:tcPr>
+          <w:p>
+            <w:pPr>
+              <w:spacing w:after="20"/>
+            </w:pPr>
+            <w:r>
+              <w:rPr>
+                <w:b w:val="0"/>
+                <w:sz w:val="18"/>
+              </w:rPr>
+              <w:t>Rectángulo horizontal con dos pequeños cuadros unidos por una barra; dos entradas 1 y salida 2.</w:t>
+            </w:r>
+          </w:p>
+        </w:tc>
+        <w:tc>
+          <w:tcPr>
+            <w:tcW w:type="dxa" w:w="2268"/>
+          </w:tcPr>
+          <w:p>
+            <w:pPr>
+              <w:spacing w:after="20"/>
+            </w:pPr>
+            <w:r>
+              <w:rPr>
+                <w:b w:val="0"/>
+                <w:sz w:val="18"/>
+              </w:rPr>
+              <w:t>Hay aire en 2 solo si llega por AMBAS entradas. Equivale a dos válvulas en serie.</w:t>
+            </w:r>
+          </w:p>
+        </w:tc>
+      </w:tr>
+      <w:tr>
+        <w:trPr>
+          <w:cantSplit/>
+        </w:trPr>
+        <w:tc>
+          <w:tcPr>
+            <w:tcW w:type="dxa" w:w="1928"/>
+          </w:tcPr>
+          <w:p>
+            <w:pPr>
+              <w:spacing w:after="20"/>
+              <w:jc w:val="center"/>
+            </w:pPr>
+            <w:r>
+              <w:drawing>
+                <wp:inline xmlns:a="http://schemas.openxmlformats.org/drawingml/2006/main" xmlns:pic="http://schemas.openxmlformats.org/drawingml/2006/picture">
+                  <wp:extent cx="474157" cy="474157"/>
+                  <wp:docPr id="12" name="Picture 12"/>
+                  <wp:cNvGraphicFramePr>
+                    <a:graphicFrameLocks noChangeAspect="1"/>
+                  </wp:cNvGraphicFramePr>
+                  <a:graphic>
+                    <a:graphicData uri="http://schemas.openxmlformats.org/drawingml/2006/picture">
+                      <pic:pic>
+                        <pic:nvPicPr>
+                          <pic:cNvPr id="0" name="sym_reguladora.png"/>
+                          <pic:cNvPicPr/>
+                        </pic:nvPicPr>
+                        <pic:blipFill>
+                          <a:blip r:embed="rId21"/>
+                          <a:stretch>
+                            <a:fillRect/>
+                          </a:stretch>
+                        </pic:blipFill>
+                        <pic:spPr>
+                          <a:xfrm>
+                            <a:off x="0" y="0"/>
+                            <a:ext cx="474157" cy="474157"/>
+                          </a:xfrm>
+                          <a:prstGeom prst="rect"/>
+                        </pic:spPr>
+                      </pic:pic>
+                    </a:graphicData>
+                  </a:graphic>
+                </wp:inline>
+              </w:drawing>
+            </w:r>
+          </w:p>
+        </w:tc>
+        <w:tc>
+          <w:tcPr>
+            <w:tcW w:type="dxa" w:w="2268"/>
+          </w:tcPr>
+          <w:p>
+            <w:pPr>
+              <w:spacing w:after="20"/>
+            </w:pPr>
+            <w:r>
+              <w:rPr>
+                <w:b/>
+                <w:color w:val="042254"/>
+                <w:sz w:val="18"/>
+              </w:rPr>
+              <w:t>Reguladora de caudal unidireccional</w:t>
+            </w:r>
+            <w:r>
+              <w:rPr>
+                <w:b w:val="0"/>
+                <w:sz w:val="18"/>
+              </w:rPr>
+              <w:br/>
+              <w:t>Válvula de estrangulación y antirretorno (regulación en un sentido)</w:t>
+            </w:r>
+          </w:p>
+        </w:tc>
+        <w:tc>
+          <w:tcPr>
+            <w:tcW w:type="dxa" w:w="3175"/>
+          </w:tcPr>
+          <w:p>
+            <w:pPr>
+              <w:spacing w:after="20"/>
+            </w:pPr>
+            <w:r>
+              <w:rPr>
+                <w:b w:val="0"/>
+                <w:sz w:val="18"/>
+              </w:rPr>
+              <w:t>Recuadro con dos ramas en paralelo: una estrangulación (dos arcos con flecha diagonal = regulable) y un antirretorno (bola sobre un asiento en V).</w:t>
+            </w:r>
+          </w:p>
+        </w:tc>
+        <w:tc>
+          <w:tcPr>
+            <w:tcW w:type="dxa" w:w="2268"/>
+          </w:tcPr>
+          <w:p>
+            <w:pPr>
+              <w:spacing w:after="20"/>
+            </w:pPr>
+            <w:r>
+              <w:rPr>
+                <w:b w:val="0"/>
+                <w:sz w:val="18"/>
+              </w:rPr>
+              <w:t>Frena el flujo en un sentido y deja pasar libre en el otro. Se monta para estrangular el ESCAPE (meter-out).</w:t>
+            </w:r>
+          </w:p>
+        </w:tc>
+      </w:tr>
+      <w:tr>
+        <w:trPr>
+          <w:cantSplit/>
+        </w:trPr>
+        <w:tc>
+          <w:tcPr>
+            <w:tcW w:type="dxa" w:w="1928"/>
+          </w:tcPr>
+          <w:p>
+            <w:pPr>
+              <w:spacing w:after="20"/>
+              <w:jc w:val="center"/>
+            </w:pPr>
+            <w:r>
+              <w:drawing>
+                <wp:inline xmlns:a="http://schemas.openxmlformats.org/drawingml/2006/main" xmlns:pic="http://schemas.openxmlformats.org/drawingml/2006/picture">
+                  <wp:extent cx="332425" cy="237078"/>
+                  <wp:docPr id="13" name="Picture 13"/>
+                  <wp:cNvGraphicFramePr>
+                    <a:graphicFrameLocks noChangeAspect="1"/>
+                  </wp:cNvGraphicFramePr>
+                  <a:graphic>
+                    <a:graphicData uri="http://schemas.openxmlformats.org/drawingml/2006/picture">
+                      <pic:pic>
+                        <pic:nvPicPr>
+                          <pic:cNvPr id="0" name="sym_fuente.png"/>
+                          <pic:cNvPicPr/>
+                        </pic:nvPicPr>
+                        <pic:blipFill>
+                          <a:blip r:embed="rId22"/>
+                          <a:stretch>
+                            <a:fillRect/>
+                          </a:stretch>
+                        </pic:blipFill>
+                        <pic:spPr>
+                          <a:xfrm>
+                            <a:off x="0" y="0"/>
+                            <a:ext cx="332425" cy="237078"/>
+                          </a:xfrm>
+                          <a:prstGeom prst="rect"/>
+                        </pic:spPr>
+                      </pic:pic>
+                    </a:graphicData>
+                  </a:graphic>
+                </wp:inline>
+              </w:drawing>
+            </w:r>
+          </w:p>
+        </w:tc>
+        <w:tc>
+          <w:tcPr>
+            <w:tcW w:type="dxa" w:w="2268"/>
+          </w:tcPr>
+          <w:p>
+            <w:pPr>
+              <w:spacing w:after="20"/>
+            </w:pPr>
+            <w:r>
+              <w:rPr>
+                <w:b/>
+                <w:color w:val="042254"/>
+                <w:sz w:val="18"/>
+              </w:rPr>
+              <w:t>Fuente de aire comprimido</w:t>
+            </w:r>
+            <w:r>
+              <w:rPr>
+                <w:b w:val="0"/>
+                <w:sz w:val="18"/>
+              </w:rPr>
+              <w:br/>
+              <w:t>Toma de presión / alimentación</w:t>
+            </w:r>
+          </w:p>
+        </w:tc>
+        <w:tc>
+          <w:tcPr>
+            <w:tcW w:type="dxa" w:w="3175"/>
+          </w:tcPr>
+          <w:p>
+            <w:pPr>
+              <w:spacing w:after="20"/>
+            </w:pPr>
+            <w:r>
+              <w:rPr>
+                <w:b w:val="0"/>
+                <w:sz w:val="18"/>
+              </w:rPr>
+              <w:t>Círculo pequeño con un triángulo relleno, colgado del puerto 1.</w:t>
+            </w:r>
+          </w:p>
+        </w:tc>
+        <w:tc>
+          <w:tcPr>
+            <w:tcW w:type="dxa" w:w="2268"/>
+          </w:tcPr>
+          <w:p>
+            <w:pPr>
+              <w:spacing w:after="20"/>
+            </w:pPr>
+            <w:r>
+              <w:rPr>
+                <w:b w:val="0"/>
+                <w:sz w:val="18"/>
+              </w:rPr>
+              <w:t>Representa la alimentación ya tratada; evita dibujar toda la red.</w:t>
+            </w:r>
+          </w:p>
+        </w:tc>
+      </w:tr>
+      <w:tr>
+        <w:trPr>
+          <w:cantSplit/>
+        </w:trPr>
+        <w:tc>
+          <w:tcPr>
+            <w:tcW w:type="dxa" w:w="1928"/>
+          </w:tcPr>
+          <w:p>
+            <w:pPr>
+              <w:spacing w:after="20"/>
+              <w:jc w:val="center"/>
+            </w:pPr>
+            <w:r>
+              <w:drawing>
+                <wp:inline xmlns:a="http://schemas.openxmlformats.org/drawingml/2006/main" xmlns:pic="http://schemas.openxmlformats.org/drawingml/2006/picture">
+                  <wp:extent cx="332425" cy="237078"/>
+                  <wp:docPr id="14" name="Picture 14"/>
+                  <wp:cNvGraphicFramePr>
+                    <a:graphicFrameLocks noChangeAspect="1"/>
+                  </wp:cNvGraphicFramePr>
+                  <a:graphic>
+                    <a:graphicData uri="http://schemas.openxmlformats.org/drawingml/2006/picture">
+                      <pic:pic>
+                        <pic:nvPicPr>
+                          <pic:cNvPr id="0" name="sym_escape.png"/>
+                          <pic:cNvPicPr/>
+                        </pic:nvPicPr>
+                        <pic:blipFill>
+                          <a:blip r:embed="rId23"/>
+                          <a:stretch>
+                            <a:fillRect/>
+                          </a:stretch>
+                        </pic:blipFill>
+                        <pic:spPr>
+                          <a:xfrm>
+                            <a:off x="0" y="0"/>
+                            <a:ext cx="332425" cy="237078"/>
+                          </a:xfrm>
+                          <a:prstGeom prst="rect"/>
+                        </pic:spPr>
+                      </pic:pic>
+                    </a:graphicData>
+                  </a:graphic>
+                </wp:inline>
+              </w:drawing>
+            </w:r>
+          </w:p>
+        </w:tc>
+        <w:tc>
+          <w:tcPr>
+            <w:tcW w:type="dxa" w:w="2268"/>
+          </w:tcPr>
+          <w:p>
+            <w:pPr>
+              <w:spacing w:after="20"/>
+            </w:pPr>
+            <w:r>
+              <w:rPr>
+                <w:b/>
+                <w:color w:val="042254"/>
+                <w:sz w:val="18"/>
+              </w:rPr>
+              <w:t>Escape a la atmósfera</w:t>
+            </w:r>
+            <w:r>
+              <w:rPr>
+                <w:b w:val="0"/>
+                <w:sz w:val="18"/>
+              </w:rPr>
+              <w:br/>
+              <w:t>Escape sin conexión</w:t>
+            </w:r>
+          </w:p>
+        </w:tc>
+        <w:tc>
+          <w:tcPr>
+            <w:tcW w:type="dxa" w:w="3175"/>
+          </w:tcPr>
+          <w:p>
+            <w:pPr>
+              <w:spacing w:after="20"/>
+            </w:pPr>
+            <w:r>
+              <w:rPr>
+                <w:b w:val="0"/>
+                <w:sz w:val="18"/>
+              </w:rPr>
+              <w:t>Triángulo abierto (sin relleno) bajo los puertos 3 y 5.</w:t>
+            </w:r>
+          </w:p>
+        </w:tc>
+        <w:tc>
+          <w:tcPr>
+            <w:tcW w:type="dxa" w:w="2268"/>
+          </w:tcPr>
+          <w:p>
+            <w:pPr>
+              <w:spacing w:after="20"/>
+            </w:pPr>
+            <w:r>
+              <w:rPr>
+                <w:b w:val="0"/>
+                <w:sz w:val="18"/>
+              </w:rPr>
+              <w:t>Salida del aire usado.</w:t>
+            </w:r>
+          </w:p>
+        </w:tc>
+      </w:tr>
+      <w:tr>
+        <w:trPr>
+          <w:cantSplit/>
+        </w:trPr>
+        <w:tc>
+          <w:tcPr>
+            <w:tcW w:type="dxa" w:w="1928"/>
+          </w:tcPr>
+          <w:p>
+            <w:pPr>
+              <w:spacing w:after="20"/>
+              <w:jc w:val="center"/>
+            </w:pPr>
+            <w:r>
+              <w:drawing>
+                <wp:inline xmlns:a="http://schemas.openxmlformats.org/drawingml/2006/main" xmlns:pic="http://schemas.openxmlformats.org/drawingml/2006/picture">
+                  <wp:extent cx="999854" cy="378810"/>
+                  <wp:docPr id="15" name="Picture 15"/>
+                  <wp:cNvGraphicFramePr>
+                    <a:graphicFrameLocks noChangeAspect="1"/>
+                  </wp:cNvGraphicFramePr>
+                  <a:graphic>
+                    <a:graphicData uri="http://schemas.openxmlformats.org/drawingml/2006/picture">
+                      <pic:pic>
+                        <pic:nvPicPr>
+                          <pic:cNvPr id="0" name="sym_unidad.png"/>
+                          <pic:cNvPicPr/>
+                        </pic:nvPicPr>
+                        <pic:blipFill>
+                          <a:blip r:embed="rId24"/>
+                          <a:stretch>
+                            <a:fillRect/>
+                          </a:stretch>
+                        </pic:blipFill>
+                        <pic:spPr>
+                          <a:xfrm>
+                            <a:off x="0" y="0"/>
+                            <a:ext cx="999854" cy="378810"/>
+                          </a:xfrm>
+                          <a:prstGeom prst="rect"/>
+                        </pic:spPr>
+                      </pic:pic>
+                    </a:graphicData>
+                  </a:graphic>
+                </wp:inline>
+              </w:drawing>
+            </w:r>
+          </w:p>
+        </w:tc>
+        <w:tc>
+          <w:tcPr>
+            <w:tcW w:type="dxa" w:w="2268"/>
+          </w:tcPr>
+          <w:p>
+            <w:pPr>
+              <w:spacing w:after="20"/>
+            </w:pPr>
+            <w:r>
+              <w:rPr>
+                <w:b/>
+                <w:color w:val="042254"/>
+                <w:sz w:val="18"/>
+              </w:rPr>
+              <w:t>Fuente + unidad de mantenimiento</w:t>
+            </w:r>
+            <w:r>
+              <w:rPr>
+                <w:b w:val="0"/>
+                <w:sz w:val="18"/>
+              </w:rPr>
+              <w:br/>
+              <w:t>Compresor y unidad de mantenimiento (filtro, regulador, manómetro)</w:t>
+            </w:r>
+          </w:p>
+        </w:tc>
+        <w:tc>
+          <w:tcPr>
+            <w:tcW w:type="dxa" w:w="3175"/>
+          </w:tcPr>
+          <w:p>
+            <w:pPr>
+              <w:spacing w:after="20"/>
+            </w:pPr>
+            <w:r>
+              <w:rPr>
+                <w:b w:val="0"/>
+                <w:sz w:val="18"/>
+              </w:rPr>
+              <w:t>Círculo con triángulo (fuente) seguido de un recuadro discontinuo con un rombo (filtro).</w:t>
+            </w:r>
+          </w:p>
+        </w:tc>
+        <w:tc>
+          <w:tcPr>
+            <w:tcW w:type="dxa" w:w="2268"/>
+          </w:tcPr>
+          <w:p>
+            <w:pPr>
+              <w:spacing w:after="20"/>
+            </w:pPr>
+            <w:r>
+              <w:rPr>
+                <w:b w:val="0"/>
+                <w:sz w:val="18"/>
+              </w:rPr>
+              <w:t>Trata el aire antes de llegar a las válvulas. Se dibuja una vez.</w:t>
+            </w:r>
+          </w:p>
+        </w:tc>
+      </w:tr>
+      <w:tr>
+        <w:trPr>
+          <w:cantSplit/>
+        </w:trPr>
+        <w:tc>
+          <w:tcPr>
+            <w:tcW w:type="dxa" w:w="1928"/>
+          </w:tcPr>
+          <w:p>
+            <w:pPr>
+              <w:spacing w:after="20"/>
+              <w:jc w:val="center"/>
+            </w:pPr>
+            <w:r>
+              <w:drawing>
+                <wp:inline xmlns:a="http://schemas.openxmlformats.org/drawingml/2006/main" xmlns:pic="http://schemas.openxmlformats.org/drawingml/2006/picture">
+                  <wp:extent cx="1116000" cy="620448"/>
+                  <wp:docPr id="16" name="Picture 16"/>
+                  <wp:cNvGraphicFramePr>
+                    <a:graphicFrameLocks noChangeAspect="1"/>
+                  </wp:cNvGraphicFramePr>
+                  <a:graphic>
+                    <a:graphicData uri="http://schemas.openxmlformats.org/drawingml/2006/picture">
+                      <pic:pic>
+                        <pic:nvPicPr>
+                          <pic:cNvPr id="0" name="sym_lineas.png"/>
+                          <pic:cNvPicPr/>
+                        </pic:nvPicPr>
+                        <pic:blipFill>
+                          <a:blip r:embed="rId25"/>
+                          <a:stretch>
+                            <a:fillRect/>
+                          </a:stretch>
+                        </pic:blipFill>
+                        <pic:spPr>
+                          <a:xfrm>
+                            <a:off x="0" y="0"/>
+                            <a:ext cx="1116000" cy="620448"/>
+                          </a:xfrm>
+                          <a:prstGeom prst="rect"/>
+                        </pic:spPr>
+                      </pic:pic>
+                    </a:graphicData>
+                  </a:graphic>
+                </wp:inline>
+              </w:drawing>
+            </w:r>
+          </w:p>
+        </w:tc>
+        <w:tc>
+          <w:tcPr>
+            <w:tcW w:type="dxa" w:w="2268"/>
+          </w:tcPr>
+          <w:p>
+            <w:pPr>
+              <w:spacing w:after="20"/>
+            </w:pPr>
+            <w:r>
+              <w:rPr>
+                <w:b/>
+                <w:color w:val="042254"/>
+                <w:sz w:val="18"/>
+              </w:rPr>
+              <w:t>Tipos de línea</w:t>
+            </w:r>
+            <w:r>
+              <w:rPr>
+                <w:b w:val="0"/>
+                <w:sz w:val="18"/>
+              </w:rPr>
+              <w:br/>
+              <w:t>Trabajo, pilotaje, grupo, unión y cruce</w:t>
+            </w:r>
+          </w:p>
+        </w:tc>
+        <w:tc>
+          <w:tcPr>
+            <w:tcW w:type="dxa" w:w="3175"/>
+          </w:tcPr>
+          <w:p>
+            <w:pPr>
+              <w:spacing w:after="20"/>
+            </w:pPr>
+            <w:r>
+              <w:rPr>
+                <w:b w:val="0"/>
+                <w:sz w:val="18"/>
+              </w:rPr>
+              <w:t>Continua = potencia; discontinua = señal/pilotaje; gruesa de color = línea de grupo de la cascada; punto = unión; cruce sin punto = no hay conexión.</w:t>
+            </w:r>
+          </w:p>
+        </w:tc>
+        <w:tc>
+          <w:tcPr>
+            <w:tcW w:type="dxa" w:w="2268"/>
+          </w:tcPr>
+          <w:p>
+            <w:pPr>
+              <w:spacing w:after="20"/>
+            </w:pPr>
+            <w:r>
+              <w:rPr>
+                <w:b w:val="0"/>
+                <w:sz w:val="18"/>
+              </w:rPr>
+              <w:t>Leer por dónde va la potencia y por dónde la información.</w:t>
+            </w:r>
+          </w:p>
+        </w:tc>
+      </w:tr>
+      <w:tr>
+        <w:trPr>
+          <w:cantSplit/>
+        </w:trPr>
+        <w:tc>
+          <w:tcPr>
+            <w:tcW w:type="dxa" w:w="1928"/>
+          </w:tcPr>
+          <w:p>
+            <w:pPr>
+              <w:spacing w:after="20"/>
+              <w:jc w:val="center"/>
+            </w:pPr>
+            <w:r>
+              <w:drawing>
+                <wp:inline xmlns:a="http://schemas.openxmlformats.org/drawingml/2006/main" xmlns:pic="http://schemas.openxmlformats.org/drawingml/2006/picture">
+                  <wp:extent cx="1116000" cy="439803"/>
+                  <wp:docPr id="17" name="Picture 17"/>
+                  <wp:cNvGraphicFramePr>
+                    <a:graphicFrameLocks noChangeAspect="1"/>
+                  </wp:cNvGraphicFramePr>
+                  <a:graphic>
+                    <a:graphicData uri="http://schemas.openxmlformats.org/drawingml/2006/picture">
+                      <pic:pic>
+                        <pic:nvPicPr>
+                          <pic:cNvPr id="0" name="sym_cil_se.png"/>
+                          <pic:cNvPicPr/>
+                        </pic:nvPicPr>
+                        <pic:blipFill>
+                          <a:blip r:embed="rId26"/>
+                          <a:stretch>
+                            <a:fillRect/>
+                          </a:stretch>
+                        </pic:blipFill>
+                        <pic:spPr>
+                          <a:xfrm>
+                            <a:off x="0" y="0"/>
+                            <a:ext cx="1116000" cy="439803"/>
+                          </a:xfrm>
+                          <a:prstGeom prst="rect"/>
+                        </pic:spPr>
+                      </pic:pic>
+                    </a:graphicData>
+                  </a:graphic>
+                </wp:inline>
+              </w:drawing>
+            </w:r>
+          </w:p>
+        </w:tc>
+        <w:tc>
+          <w:tcPr>
+            <w:tcW w:type="dxa" w:w="2268"/>
+          </w:tcPr>
+          <w:p>
+            <w:pPr>
+              <w:spacing w:after="20"/>
+            </w:pPr>
+            <w:r>
+              <w:rPr>
+                <w:b/>
+                <w:color w:val="042254"/>
+                <w:sz w:val="18"/>
+              </w:rPr>
+              <w:t>Cilindro de simple efecto</w:t>
+            </w:r>
+            <w:r>
+              <w:rPr>
+                <w:b w:val="0"/>
+                <w:sz w:val="18"/>
+              </w:rPr>
+              <w:br/>
+              <w:t>Actuador lineal de simple efecto, retorno por resorte</w:t>
+            </w:r>
+          </w:p>
+        </w:tc>
+        <w:tc>
+          <w:tcPr>
+            <w:tcW w:type="dxa" w:w="3175"/>
+          </w:tcPr>
+          <w:p>
+            <w:pPr>
+              <w:spacing w:after="20"/>
+            </w:pPr>
+            <w:r>
+              <w:rPr>
+                <w:b w:val="0"/>
+                <w:sz w:val="18"/>
+              </w:rPr>
+              <w:t>Como el de doble efecto pero con UNA sola conexión y un resorte dibujado en el lado del vástago.</w:t>
+            </w:r>
+          </w:p>
+        </w:tc>
+        <w:tc>
+          <w:tcPr>
+            <w:tcW w:type="dxa" w:w="2268"/>
+          </w:tcPr>
+          <w:p>
+            <w:pPr>
+              <w:spacing w:after="20"/>
+            </w:pPr>
+            <w:r>
+              <w:rPr>
+                <w:b w:val="0"/>
+                <w:sz w:val="18"/>
+              </w:rPr>
+              <w:t>Avanza con aire y retrocede por el resorte.</w:t>
+            </w:r>
+          </w:p>
+        </w:tc>
+      </w:tr>
+      <w:tr>
+        <w:trPr>
+          <w:cantSplit/>
+        </w:trPr>
+        <w:tc>
+          <w:tcPr>
+            <w:tcW w:type="dxa" w:w="1928"/>
+          </w:tcPr>
+          <w:p>
+            <w:pPr>
+              <w:spacing w:after="20"/>
+              <w:jc w:val="center"/>
+            </w:pPr>
+            <w:r>
+              <w:drawing>
+                <wp:inline xmlns:a="http://schemas.openxmlformats.org/drawingml/2006/main" xmlns:pic="http://schemas.openxmlformats.org/drawingml/2006/picture">
+                  <wp:extent cx="1046239" cy="618466"/>
+                  <wp:docPr id="18" name="Picture 18"/>
+                  <wp:cNvGraphicFramePr>
+                    <a:graphicFrameLocks noChangeAspect="1"/>
+                  </wp:cNvGraphicFramePr>
+                  <a:graphic>
+                    <a:graphicData uri="http://schemas.openxmlformats.org/drawingml/2006/picture">
+                      <pic:pic>
+                        <pic:nvPicPr>
+                          <pic:cNvPr id="0" name="sym_52_pilot_resorte.png"/>
+                          <pic:cNvPicPr/>
+                        </pic:nvPicPr>
+                        <pic:blipFill>
+                          <a:blip r:embed="rId27"/>
+                          <a:stretch>
+                            <a:fillRect/>
+                          </a:stretch>
+                        </pic:blipFill>
+                        <pic:spPr>
+                          <a:xfrm>
+                            <a:off x="0" y="0"/>
+                            <a:ext cx="1046239" cy="618466"/>
+                          </a:xfrm>
+                          <a:prstGeom prst="rect"/>
+                        </pic:spPr>
+                      </pic:pic>
+                    </a:graphicData>
+                  </a:graphic>
+                </wp:inline>
+              </w:drawing>
+            </w:r>
+          </w:p>
+        </w:tc>
+        <w:tc>
+          <w:tcPr>
+            <w:tcW w:type="dxa" w:w="2268"/>
+          </w:tcPr>
+          <w:p>
+            <w:pPr>
+              <w:spacing w:after="20"/>
+            </w:pPr>
+            <w:r>
+              <w:rPr>
+                <w:b/>
+                <w:color w:val="042254"/>
+                <w:sz w:val="18"/>
+              </w:rPr>
+              <w:t>Válvula 5/2 monoestable (piloto / resorte)</w:t>
+            </w:r>
+            <w:r>
+              <w:rPr>
+                <w:b w:val="0"/>
+                <w:sz w:val="18"/>
+              </w:rPr>
+              <w:br/>
+              <w:t>Válvula distribuidora 5/2, pilotaje neumático 14, retorno por resorte</w:t>
+            </w:r>
+          </w:p>
+        </w:tc>
+        <w:tc>
+          <w:tcPr>
+            <w:tcW w:type="dxa" w:w="3175"/>
+          </w:tcPr>
+          <w:p>
+            <w:pPr>
+              <w:spacing w:after="20"/>
+            </w:pPr>
+            <w:r>
+              <w:rPr>
+                <w:b w:val="0"/>
+                <w:sz w:val="18"/>
+              </w:rPr>
+              <w:t>Triángulo de pilotaje solo a la izquierda y resorte a la derecha.</w:t>
+            </w:r>
+          </w:p>
+        </w:tc>
+        <w:tc>
+          <w:tcPr>
+            <w:tcW w:type="dxa" w:w="2268"/>
+          </w:tcPr>
+          <w:p>
+            <w:pPr>
+              <w:spacing w:after="20"/>
+            </w:pPr>
+            <w:r>
+              <w:rPr>
+                <w:b w:val="0"/>
+                <w:sz w:val="18"/>
+              </w:rPr>
+              <w:t>Necesita señal mantenida; al quitarla vuelve al reposo.</w:t>
+            </w:r>
+          </w:p>
+        </w:tc>
+      </w:tr>
+      <w:tr>
+        <w:trPr>
+          <w:cantSplit/>
+        </w:trPr>
+        <w:tc>
+          <w:tcPr>
+            <w:tcW w:type="dxa" w:w="1928"/>
+          </w:tcPr>
+          <w:p>
+            <w:pPr>
+              <w:spacing w:after="20"/>
+              <w:jc w:val="center"/>
+            </w:pPr>
+            <w:r>
+              <w:drawing>
+                <wp:inline xmlns:a="http://schemas.openxmlformats.org/drawingml/2006/main" xmlns:pic="http://schemas.openxmlformats.org/drawingml/2006/picture">
+                  <wp:extent cx="1046239" cy="618466"/>
+                  <wp:docPr id="19" name="Picture 19"/>
+                  <wp:cNvGraphicFramePr>
+                    <a:graphicFrameLocks noChangeAspect="1"/>
+                  </wp:cNvGraphicFramePr>
+                  <a:graphic>
+                    <a:graphicData uri="http://schemas.openxmlformats.org/drawingml/2006/picture">
+                      <pic:pic>
+                        <pic:nvPicPr>
+                          <pic:cNvPr id="0" name="sym_32_rodillo_esc.png"/>
+                          <pic:cNvPicPr/>
+                        </pic:nvPicPr>
+                        <pic:blipFill>
+                          <a:blip r:embed="rId28"/>
+                          <a:stretch>
+                            <a:fillRect/>
+                          </a:stretch>
+                        </pic:blipFill>
+                        <pic:spPr>
+                          <a:xfrm>
+                            <a:off x="0" y="0"/>
+                            <a:ext cx="1046239" cy="618466"/>
+                          </a:xfrm>
+                          <a:prstGeom prst="rect"/>
+                        </pic:spPr>
+                      </pic:pic>
+                    </a:graphicData>
+                  </a:graphic>
+                </wp:inline>
+              </w:drawing>
+            </w:r>
+          </w:p>
+        </w:tc>
+        <w:tc>
+          <w:tcPr>
+            <w:tcW w:type="dxa" w:w="2268"/>
+          </w:tcPr>
+          <w:p>
+            <w:pPr>
+              <w:spacing w:after="20"/>
+            </w:pPr>
+            <w:r>
+              <w:rPr>
+                <w:b/>
+                <w:color w:val="042254"/>
+                <w:sz w:val="18"/>
+              </w:rPr>
+              <w:t>Válvula 3/2 con rodillo escamoteable</w:t>
+            </w:r>
+            <w:r>
+              <w:rPr>
+                <w:b w:val="0"/>
+                <w:sz w:val="18"/>
+              </w:rPr>
+              <w:br/>
+              <w:t>Válvula 3/2 NC, rodillo abatible (actúa en un solo sentido)</w:t>
+            </w:r>
+          </w:p>
+        </w:tc>
+        <w:tc>
+          <w:tcPr>
+            <w:tcW w:type="dxa" w:w="3175"/>
+          </w:tcPr>
+          <w:p>
+            <w:pPr>
+              <w:spacing w:after="20"/>
+            </w:pPr>
+            <w:r>
+              <w:rPr>
+                <w:b w:val="0"/>
+                <w:sz w:val="18"/>
+              </w:rPr>
+              <w:t>El rodillo está sobre una palanca articulada y lleva una flecha que indica el único sentido en que actúa.</w:t>
+            </w:r>
+          </w:p>
+        </w:tc>
+        <w:tc>
+          <w:tcPr>
+            <w:tcW w:type="dxa" w:w="2268"/>
+          </w:tcPr>
+          <w:p>
+            <w:pPr>
+              <w:spacing w:after="20"/>
+            </w:pPr>
+            <w:r>
+              <w:rPr>
+                <w:b w:val="0"/>
+                <w:sz w:val="18"/>
+              </w:rPr>
+              <w:t>Da solo un pulso: alternativa sencilla para evitar señales bloqueadas.</w:t>
+            </w:r>
+          </w:p>
+        </w:tc>
+      </w:tr>
+    </w:tbl>
+    <w:p>
+      <w:pPr>
+        <w:spacing w:after="40"/>
+      </w:pPr>
+    </w:p>
+    <w:p>
+      <w:r>
+        <w:rPr>
+          <w:b w:val="0"/>
+          <w:i/>
+          <w:color w:val="555F6D"/>
+          <w:sz w:val="18"/>
+        </w:rPr>
+        <w:t>Los tres últimos (simple efecto, 5/2 monoestable y rodillo escamoteable) se ven en teoría pero no son necesarios para resolver las PD 10 y 11.</w:t>
+      </w:r>
+    </w:p>
+    <w:p>
+      <w:pPr>
         <w:pStyle w:val="Heading3"/>
       </w:pPr>
       <w:r>
@@ -720,7 +2927,7 @@
         <w:drawing>
           <wp:inline xmlns:a="http://schemas.openxmlformats.org/drawingml/2006/main" xmlns:pic="http://schemas.openxmlformats.org/drawingml/2006/picture">
             <wp:extent cx="4860000" cy="3639963"/>
-            <wp:docPr id="1" name="Picture 1"/>
+            <wp:docPr id="20" name="Picture 20"/>
             <wp:cNvGraphicFramePr>
               <a:graphicFrameLocks noChangeAspect="1"/>
             </wp:cNvGraphicFramePr>
@@ -732,7 +2939,7 @@
                     <pic:cNvPicPr/>
                   </pic:nvPicPr>
                   <pic:blipFill>
-                    <a:blip r:embed="rId10"/>
+                    <a:blip r:embed="rId29"/>
                     <a:stretch>
                       <a:fillRect/>
                     </a:stretch>
@@ -1025,7 +3232,7 @@
         <w:drawing>
           <wp:inline xmlns:a="http://schemas.openxmlformats.org/drawingml/2006/main" xmlns:pic="http://schemas.openxmlformats.org/drawingml/2006/picture">
             <wp:extent cx="2160000" cy="1776316"/>
-            <wp:docPr id="2" name="Picture 2"/>
+            <wp:docPr id="21" name="Picture 21"/>
             <wp:cNvGraphicFramePr>
               <a:graphicFrameLocks noChangeAspect="1"/>
             </wp:cNvGraphicFramePr>
@@ -1037,7 +3244,7 @@
                     <pic:cNvPicPr/>
                   </pic:nvPicPr>
                   <pic:blipFill>
-                    <a:blip r:embed="rId11"/>
+                    <a:blip r:embed="rId30"/>
                     <a:stretch>
                       <a:fillRect/>
                     </a:stretch>
@@ -1424,7 +3631,7 @@
         <w:drawing>
           <wp:inline xmlns:a="http://schemas.openxmlformats.org/drawingml/2006/main" xmlns:pic="http://schemas.openxmlformats.org/drawingml/2006/picture">
             <wp:extent cx="2520000" cy="1540000"/>
-            <wp:docPr id="3" name="Picture 3"/>
+            <wp:docPr id="22" name="Picture 22"/>
             <wp:cNvGraphicFramePr>
               <a:graphicFrameLocks noChangeAspect="1"/>
             </wp:cNvGraphicFramePr>
@@ -1436,7 +3643,7 @@
                     <pic:cNvPicPr/>
                   </pic:nvPicPr>
                   <pic:blipFill>
-                    <a:blip r:embed="rId12"/>
+                    <a:blip r:embed="rId31"/>
                     <a:stretch>
                       <a:fillRect/>
                     </a:stretch>
@@ -1647,7 +3854,7 @@
         <w:drawing>
           <wp:inline xmlns:a="http://schemas.openxmlformats.org/drawingml/2006/main" xmlns:pic="http://schemas.openxmlformats.org/drawingml/2006/picture">
             <wp:extent cx="1800000" cy="2012227"/>
-            <wp:docPr id="4" name="Picture 4"/>
+            <wp:docPr id="23" name="Picture 23"/>
             <wp:cNvGraphicFramePr>
               <a:graphicFrameLocks noChangeAspect="1"/>
             </wp:cNvGraphicFramePr>
@@ -1659,7 +3866,7 @@
                     <pic:cNvPicPr/>
                   </pic:nvPicPr>
                   <pic:blipFill>
-                    <a:blip r:embed="rId13"/>
+                    <a:blip r:embed="rId32"/>
                     <a:stretch>
                       <a:fillRect/>
                     </a:stretch>
@@ -1850,7 +4057,7 @@
         <w:drawing>
           <wp:inline xmlns:a="http://schemas.openxmlformats.org/drawingml/2006/main" xmlns:pic="http://schemas.openxmlformats.org/drawingml/2006/picture">
             <wp:extent cx="3960000" cy="2397470"/>
-            <wp:docPr id="5" name="Picture 5"/>
+            <wp:docPr id="24" name="Picture 24"/>
             <wp:cNvGraphicFramePr>
               <a:graphicFrameLocks noChangeAspect="1"/>
             </wp:cNvGraphicFramePr>
@@ -1862,7 +4069,7 @@
                     <pic:cNvPicPr/>
                   </pic:nvPicPr>
                   <pic:blipFill>
-                    <a:blip r:embed="rId14"/>
+                    <a:blip r:embed="rId33"/>
                     <a:stretch>
                       <a:fillRect/>
                     </a:stretch>

</xml_diff>